<commit_message>
Update Hospital Management System document photos
</commit_message>
<xml_diff>
--- a/Hospital Management System/Hospital Management System.docx
+++ b/Hospital Management System/Hospital Management System.docx
@@ -970,8 +970,8 @@
           <w:noProof/>
         </w:rPr>
         <w:drawing>
-          <wp:inline distT="0" distB="0" distL="0" distR="0" wp14:anchorId="03C99169" wp14:editId="66DC1B58">
-            <wp:extent cx="5026395" cy="7510072"/>
+          <wp:inline distT="0" distB="0" distL="0" distR="0" wp14:anchorId="03C99169" wp14:editId="382CDD97">
+            <wp:extent cx="5038894" cy="7437481"/>
             <wp:effectExtent l="0" t="0" r="0" b="0"/>
             <wp:docPr id="352461668" name="Picture 3"/>
             <wp:cNvGraphicFramePr>
@@ -981,11 +981,11 @@
               <a:graphicData uri="http://schemas.openxmlformats.org/drawingml/2006/picture">
                 <pic:pic xmlns:pic="http://schemas.openxmlformats.org/drawingml/2006/picture">
                   <pic:nvPicPr>
-                    <pic:cNvPr id="352461668" name="Picture 352461668"/>
+                    <pic:cNvPr id="352461668" name="Picture 3"/>
                     <pic:cNvPicPr/>
                   </pic:nvPicPr>
                   <pic:blipFill>
-                    <a:blip r:embed="rId7" cstate="print">
+                    <a:blip r:embed="rId7">
                       <a:extLst>
                         <a:ext uri="{28A0092B-C50C-407E-A947-70E740481C1C}">
                           <a14:useLocalDpi xmlns:a14="http://schemas.microsoft.com/office/drawing/2010/main" val="0"/>
@@ -999,7 +999,7 @@
                   <pic:spPr>
                     <a:xfrm>
                       <a:off x="0" y="0"/>
-                      <a:ext cx="5038894" cy="7528746"/>
+                      <a:ext cx="5038894" cy="7437481"/>
                     </a:xfrm>
                     <a:prstGeom prst="rect">
                       <a:avLst/>
@@ -1685,8 +1685,8 @@
           <w:noProof/>
         </w:rPr>
         <w:drawing>
-          <wp:inline distT="0" distB="0" distL="0" distR="0" wp14:anchorId="2511F3A2" wp14:editId="3CBC6093">
-            <wp:extent cx="3567659" cy="7884442"/>
+          <wp:inline distT="0" distB="0" distL="0" distR="0" wp14:anchorId="2511F3A2" wp14:editId="045CFDEC">
+            <wp:extent cx="5046345" cy="7880595"/>
             <wp:effectExtent l="0" t="0" r="0" b="0"/>
             <wp:docPr id="775221616" name="Picture 4"/>
             <wp:cNvGraphicFramePr>
@@ -1696,7 +1696,7 @@
               <a:graphicData uri="http://schemas.openxmlformats.org/drawingml/2006/picture">
                 <pic:pic xmlns:pic="http://schemas.openxmlformats.org/drawingml/2006/picture">
                   <pic:nvPicPr>
-                    <pic:cNvPr id="775221616" name="Picture 775221616"/>
+                    <pic:cNvPr id="775221616" name="Picture 4"/>
                     <pic:cNvPicPr/>
                   </pic:nvPicPr>
                   <pic:blipFill>
@@ -1714,7 +1714,7 @@
                   <pic:spPr>
                     <a:xfrm>
                       <a:off x="0" y="0"/>
-                      <a:ext cx="3614873" cy="7988784"/>
+                      <a:ext cx="5116715" cy="7990488"/>
                     </a:xfrm>
                     <a:prstGeom prst="rect">
                       <a:avLst/>
@@ -1737,6 +1737,22 @@
     </w:p>
     <w:p>
       <w:pPr>
+        <w:rPr>
+          <w:rFonts w:ascii="Times New Roman" w:eastAsiaTheme="majorEastAsia" w:hAnsi="Times New Roman" w:cs="Times New Roman"/>
+          <w:color w:val="0F4761" w:themeColor="accent1" w:themeShade="BF"/>
+          <w:sz w:val="32"/>
+          <w:szCs w:val="32"/>
+        </w:rPr>
+      </w:pPr>
+      <w:r>
+        <w:rPr>
+          <w:rFonts w:ascii="Times New Roman" w:hAnsi="Times New Roman" w:cs="Times New Roman"/>
+        </w:rPr>
+        <w:br w:type="page"/>
+      </w:r>
+    </w:p>
+    <w:p>
+      <w:pPr>
         <w:pStyle w:val="Heading2"/>
         <w:jc w:val="both"/>
         <w:rPr>
@@ -2609,8 +2625,8 @@
           <w:noProof/>
         </w:rPr>
         <w:drawing>
-          <wp:inline distT="0" distB="0" distL="0" distR="0" wp14:anchorId="21D1AF43" wp14:editId="1C964FCC">
-            <wp:extent cx="4736892" cy="7540557"/>
+          <wp:inline distT="0" distB="0" distL="0" distR="0" wp14:anchorId="21D1AF43" wp14:editId="56A3D960">
+            <wp:extent cx="6273336" cy="3553428"/>
             <wp:effectExtent l="0" t="0" r="0" b="0"/>
             <wp:docPr id="1294814328" name="Picture 5"/>
             <wp:cNvGraphicFramePr>
@@ -2620,11 +2636,11 @@
               <a:graphicData uri="http://schemas.openxmlformats.org/drawingml/2006/picture">
                 <pic:pic xmlns:pic="http://schemas.openxmlformats.org/drawingml/2006/picture">
                   <pic:nvPicPr>
-                    <pic:cNvPr id="1294814328" name="Picture 1294814328"/>
+                    <pic:cNvPr id="1294814328" name="Picture 5"/>
                     <pic:cNvPicPr/>
                   </pic:nvPicPr>
                   <pic:blipFill>
-                    <a:blip r:embed="rId9" cstate="print">
+                    <a:blip r:embed="rId9">
                       <a:extLst>
                         <a:ext uri="{28A0092B-C50C-407E-A947-70E740481C1C}">
                           <a14:useLocalDpi xmlns:a14="http://schemas.microsoft.com/office/drawing/2010/main" val="0"/>
@@ -2638,7 +2654,7 @@
                   <pic:spPr>
                     <a:xfrm>
                       <a:off x="0" y="0"/>
-                      <a:ext cx="4795800" cy="7634332"/>
+                      <a:ext cx="6295208" cy="3565817"/>
                     </a:xfrm>
                     <a:prstGeom prst="rect">
                       <a:avLst/>
@@ -2649,6 +2665,22 @@
             </a:graphic>
           </wp:inline>
         </w:drawing>
+      </w:r>
+    </w:p>
+    <w:p>
+      <w:pPr>
+        <w:rPr>
+          <w:rFonts w:ascii="Times New Roman" w:eastAsiaTheme="majorEastAsia" w:hAnsi="Times New Roman" w:cs="Times New Roman"/>
+          <w:color w:val="0F4761" w:themeColor="accent1" w:themeShade="BF"/>
+          <w:sz w:val="32"/>
+          <w:szCs w:val="32"/>
+        </w:rPr>
+      </w:pPr>
+      <w:r>
+        <w:rPr>
+          <w:rFonts w:ascii="Times New Roman" w:hAnsi="Times New Roman" w:cs="Times New Roman"/>
+        </w:rPr>
+        <w:br w:type="page"/>
       </w:r>
     </w:p>
     <w:p>

</xml_diff>

<commit_message>
Update Hospital Management System document files
</commit_message>
<xml_diff>
--- a/Hospital Management System/Hospital Management System.docx
+++ b/Hospital Management System/Hospital Management System.docx
@@ -1685,8 +1685,8 @@
           <w:noProof/>
         </w:rPr>
         <w:drawing>
-          <wp:inline distT="0" distB="0" distL="0" distR="0" wp14:anchorId="2511F3A2" wp14:editId="045CFDEC">
-            <wp:extent cx="5046345" cy="7880595"/>
+          <wp:inline distT="0" distB="0" distL="0" distR="0" wp14:anchorId="2511F3A2" wp14:editId="6D903216">
+            <wp:extent cx="4965946" cy="7755038"/>
             <wp:effectExtent l="0" t="0" r="0" b="0"/>
             <wp:docPr id="775221616" name="Picture 4"/>
             <wp:cNvGraphicFramePr>
@@ -1714,7 +1714,7 @@
                   <pic:spPr>
                     <a:xfrm>
                       <a:off x="0" y="0"/>
-                      <a:ext cx="5116715" cy="7990488"/>
+                      <a:ext cx="4972408" cy="7765130"/>
                     </a:xfrm>
                     <a:prstGeom prst="rect">
                       <a:avLst/>
@@ -1793,7 +1793,7 @@
           <w:ilvl w:val="0"/>
           <w:numId w:val="21"/>
         </w:numPr>
-        <w:spacing w:before="100" w:beforeAutospacing="1" w:after="100" w:afterAutospacing="1"/>
+        <w:spacing w:after="100" w:afterAutospacing="1"/>
         <w:rPr>
           <w:rFonts w:ascii="Times New Roman" w:hAnsi="Times New Roman" w:cs="Times New Roman"/>
         </w:rPr>
@@ -1811,7 +1811,7 @@
           <w:ilvl w:val="0"/>
           <w:numId w:val="21"/>
         </w:numPr>
-        <w:spacing w:before="100" w:beforeAutospacing="1" w:after="100" w:afterAutospacing="1"/>
+        <w:spacing w:after="100" w:afterAutospacing="1"/>
         <w:rPr>
           <w:rFonts w:ascii="Times New Roman" w:hAnsi="Times New Roman" w:cs="Times New Roman"/>
         </w:rPr>
@@ -1829,7 +1829,7 @@
           <w:ilvl w:val="0"/>
           <w:numId w:val="21"/>
         </w:numPr>
-        <w:spacing w:before="100" w:beforeAutospacing="1" w:after="100" w:afterAutospacing="1"/>
+        <w:spacing w:after="100" w:afterAutospacing="1"/>
         <w:rPr>
           <w:rFonts w:ascii="Times New Roman" w:hAnsi="Times New Roman" w:cs="Times New Roman"/>
         </w:rPr>
@@ -1847,7 +1847,7 @@
           <w:ilvl w:val="0"/>
           <w:numId w:val="21"/>
         </w:numPr>
-        <w:spacing w:before="100" w:beforeAutospacing="1" w:after="100" w:afterAutospacing="1"/>
+        <w:spacing w:after="100" w:afterAutospacing="1"/>
         <w:rPr>
           <w:rFonts w:ascii="Times New Roman" w:hAnsi="Times New Roman" w:cs="Times New Roman"/>
         </w:rPr>
@@ -1873,7 +1873,7 @@
           <w:ilvl w:val="0"/>
           <w:numId w:val="21"/>
         </w:numPr>
-        <w:spacing w:before="100" w:beforeAutospacing="1" w:after="100" w:afterAutospacing="1"/>
+        <w:spacing w:after="100" w:afterAutospacing="1"/>
         <w:rPr>
           <w:rFonts w:ascii="Times New Roman" w:hAnsi="Times New Roman" w:cs="Times New Roman"/>
         </w:rPr>
@@ -1891,7 +1891,7 @@
           <w:ilvl w:val="0"/>
           <w:numId w:val="21"/>
         </w:numPr>
-        <w:spacing w:before="100" w:beforeAutospacing="1" w:after="100" w:afterAutospacing="1"/>
+        <w:spacing w:after="100" w:afterAutospacing="1"/>
         <w:rPr>
           <w:rFonts w:ascii="Times New Roman" w:hAnsi="Times New Roman" w:cs="Times New Roman"/>
         </w:rPr>
@@ -1929,7 +1929,7 @@
           <w:ilvl w:val="0"/>
           <w:numId w:val="22"/>
         </w:numPr>
-        <w:spacing w:before="100" w:beforeAutospacing="1" w:after="100" w:afterAutospacing="1"/>
+        <w:spacing w:after="100" w:afterAutospacing="1"/>
         <w:rPr>
           <w:rFonts w:ascii="Times New Roman" w:hAnsi="Times New Roman" w:cs="Times New Roman"/>
         </w:rPr>
@@ -1947,7 +1947,7 @@
           <w:ilvl w:val="0"/>
           <w:numId w:val="22"/>
         </w:numPr>
-        <w:spacing w:before="100" w:beforeAutospacing="1" w:after="100" w:afterAutospacing="1"/>
+        <w:spacing w:after="100" w:afterAutospacing="1"/>
         <w:rPr>
           <w:rFonts w:ascii="Times New Roman" w:hAnsi="Times New Roman" w:cs="Times New Roman"/>
         </w:rPr>
@@ -1965,7 +1965,7 @@
           <w:ilvl w:val="0"/>
           <w:numId w:val="22"/>
         </w:numPr>
-        <w:spacing w:before="100" w:beforeAutospacing="1" w:after="100" w:afterAutospacing="1"/>
+        <w:spacing w:after="100" w:afterAutospacing="1"/>
         <w:rPr>
           <w:rFonts w:ascii="Times New Roman" w:hAnsi="Times New Roman" w:cs="Times New Roman"/>
         </w:rPr>
@@ -1983,7 +1983,7 @@
           <w:ilvl w:val="0"/>
           <w:numId w:val="22"/>
         </w:numPr>
-        <w:spacing w:before="100" w:beforeAutospacing="1" w:after="100" w:afterAutospacing="1"/>
+        <w:spacing w:after="100" w:afterAutospacing="1"/>
         <w:rPr>
           <w:rFonts w:ascii="Times New Roman" w:hAnsi="Times New Roman" w:cs="Times New Roman"/>
         </w:rPr>
@@ -2001,7 +2001,7 @@
           <w:ilvl w:val="0"/>
           <w:numId w:val="22"/>
         </w:numPr>
-        <w:spacing w:before="100" w:beforeAutospacing="1" w:after="100" w:afterAutospacing="1"/>
+        <w:spacing w:after="100" w:afterAutospacing="1"/>
         <w:rPr>
           <w:rFonts w:ascii="Times New Roman" w:hAnsi="Times New Roman" w:cs="Times New Roman"/>
         </w:rPr>
@@ -2534,8 +2534,34 @@
         <w:rPr>
           <w:rStyle w:val="Strong"/>
         </w:rPr>
+        <w:t>BILL</w:t>
+      </w:r>
+    </w:p>
+    <w:p>
+      <w:pPr>
+        <w:numPr>
+          <w:ilvl w:val="0"/>
+          <w:numId w:val="28"/>
+        </w:numPr>
+        <w:spacing w:after="100" w:afterAutospacing="1"/>
+        <w:rPr>
+          <w:rFonts w:ascii="Times New Roman" w:hAnsi="Times New Roman" w:cs="Times New Roman"/>
+        </w:rPr>
+      </w:pPr>
+      <w:proofErr w:type="spellStart"/>
+      <w:r>
+        <w:rPr>
+          <w:rFonts w:ascii="Times New Roman" w:hAnsi="Times New Roman" w:cs="Times New Roman"/>
+        </w:rPr>
         <w:lastRenderedPageBreak/>
-        <w:t>BILL</w:t>
+        <w:t>bill_id</w:t>
+      </w:r>
+      <w:proofErr w:type="spellEnd"/>
+      <w:r>
+        <w:rPr>
+          <w:rFonts w:ascii="Times New Roman" w:hAnsi="Times New Roman" w:cs="Times New Roman"/>
+        </w:rPr>
+        <w:t xml:space="preserve"> (PK) </w:t>
       </w:r>
     </w:p>
     <w:p>
@@ -2554,14 +2580,14 @@
         <w:rPr>
           <w:rFonts w:ascii="Times New Roman" w:hAnsi="Times New Roman" w:cs="Times New Roman"/>
         </w:rPr>
-        <w:t>bill_id</w:t>
+        <w:t>patient_id</w:t>
       </w:r>
       <w:proofErr w:type="spellEnd"/>
       <w:r>
         <w:rPr>
           <w:rFonts w:ascii="Times New Roman" w:hAnsi="Times New Roman" w:cs="Times New Roman"/>
         </w:rPr>
-        <w:t xml:space="preserve"> (PK) </w:t>
+        <w:t xml:space="preserve"> (FK) </w:t>
       </w:r>
     </w:p>
     <w:p>
@@ -2575,32 +2601,6 @@
           <w:rFonts w:ascii="Times New Roman" w:hAnsi="Times New Roman" w:cs="Times New Roman"/>
         </w:rPr>
       </w:pPr>
-      <w:proofErr w:type="spellStart"/>
-      <w:r>
-        <w:rPr>
-          <w:rFonts w:ascii="Times New Roman" w:hAnsi="Times New Roman" w:cs="Times New Roman"/>
-        </w:rPr>
-        <w:t>patient_id</w:t>
-      </w:r>
-      <w:proofErr w:type="spellEnd"/>
-      <w:r>
-        <w:rPr>
-          <w:rFonts w:ascii="Times New Roman" w:hAnsi="Times New Roman" w:cs="Times New Roman"/>
-        </w:rPr>
-        <w:t xml:space="preserve"> (FK) </w:t>
-      </w:r>
-    </w:p>
-    <w:p>
-      <w:pPr>
-        <w:numPr>
-          <w:ilvl w:val="0"/>
-          <w:numId w:val="28"/>
-        </w:numPr>
-        <w:spacing w:after="100" w:afterAutospacing="1"/>
-        <w:rPr>
-          <w:rFonts w:ascii="Times New Roman" w:hAnsi="Times New Roman" w:cs="Times New Roman"/>
-        </w:rPr>
-      </w:pPr>
       <w:r>
         <w:rPr>
           <w:rFonts w:ascii="Times New Roman" w:hAnsi="Times New Roman" w:cs="Times New Roman"/>
@@ -2625,9 +2625,9 @@
           <w:noProof/>
         </w:rPr>
         <w:drawing>
-          <wp:inline distT="0" distB="0" distL="0" distR="0" wp14:anchorId="21D1AF43" wp14:editId="56A3D960">
-            <wp:extent cx="6273336" cy="3553428"/>
-            <wp:effectExtent l="0" t="0" r="0" b="0"/>
+          <wp:inline distT="0" distB="0" distL="0" distR="0" wp14:anchorId="21D1AF43" wp14:editId="7B86B642">
+            <wp:extent cx="5892800" cy="3337879"/>
+            <wp:effectExtent l="0" t="0" r="0" b="2540"/>
             <wp:docPr id="1294814328" name="Picture 5"/>
             <wp:cNvGraphicFramePr>
               <a:graphicFrameLocks xmlns:a="http://schemas.openxmlformats.org/drawingml/2006/main" noChangeAspect="1"/>
@@ -2654,7 +2654,7 @@
                   <pic:spPr>
                     <a:xfrm>
                       <a:off x="0" y="0"/>
-                      <a:ext cx="6295208" cy="3565817"/>
+                      <a:ext cx="5929018" cy="3358394"/>
                     </a:xfrm>
                     <a:prstGeom prst="rect">
                       <a:avLst/>
@@ -2669,6 +2669,11 @@
     </w:p>
     <w:p>
       <w:pPr>
+        <w:pStyle w:val="BodyText"/>
+      </w:pPr>
+    </w:p>
+    <w:p>
+      <w:pPr>
         <w:rPr>
           <w:rFonts w:ascii="Times New Roman" w:eastAsiaTheme="majorEastAsia" w:hAnsi="Times New Roman" w:cs="Times New Roman"/>
           <w:color w:val="0F4761" w:themeColor="accent1" w:themeShade="BF"/>
@@ -2676,6 +2681,56 @@
           <w:szCs w:val="32"/>
         </w:rPr>
       </w:pPr>
+      <w:r>
+        <w:rPr>
+          <w:rFonts w:ascii="Times New Roman" w:eastAsiaTheme="majorEastAsia" w:hAnsi="Times New Roman" w:cs="Times New Roman"/>
+          <w:noProof/>
+          <w:color w:val="0F4761" w:themeColor="accent1" w:themeShade="BF"/>
+          <w:sz w:val="32"/>
+          <w:szCs w:val="32"/>
+        </w:rPr>
+        <w:drawing>
+          <wp:inline distT="0" distB="0" distL="0" distR="0" wp14:anchorId="5A879D0A" wp14:editId="027CB7E1">
+            <wp:extent cx="5893024" cy="3946968"/>
+            <wp:effectExtent l="0" t="0" r="0" b="3175"/>
+            <wp:docPr id="658640458" name="Picture 1"/>
+            <wp:cNvGraphicFramePr>
+              <a:graphicFrameLocks xmlns:a="http://schemas.openxmlformats.org/drawingml/2006/main" noChangeAspect="1"/>
+            </wp:cNvGraphicFramePr>
+            <a:graphic xmlns:a="http://schemas.openxmlformats.org/drawingml/2006/main">
+              <a:graphicData uri="http://schemas.openxmlformats.org/drawingml/2006/picture">
+                <pic:pic xmlns:pic="http://schemas.openxmlformats.org/drawingml/2006/picture">
+                  <pic:nvPicPr>
+                    <pic:cNvPr id="658640458" name="Picture 658640458"/>
+                    <pic:cNvPicPr/>
+                  </pic:nvPicPr>
+                  <pic:blipFill>
+                    <a:blip r:embed="rId10">
+                      <a:extLst>
+                        <a:ext uri="{28A0092B-C50C-407E-A947-70E740481C1C}">
+                          <a14:useLocalDpi xmlns:a14="http://schemas.microsoft.com/office/drawing/2010/main" val="0"/>
+                        </a:ext>
+                      </a:extLst>
+                    </a:blip>
+                    <a:stretch>
+                      <a:fillRect/>
+                    </a:stretch>
+                  </pic:blipFill>
+                  <pic:spPr>
+                    <a:xfrm>
+                      <a:off x="0" y="0"/>
+                      <a:ext cx="5895167" cy="3948403"/>
+                    </a:xfrm>
+                    <a:prstGeom prst="rect">
+                      <a:avLst/>
+                    </a:prstGeom>
+                  </pic:spPr>
+                </pic:pic>
+              </a:graphicData>
+            </a:graphic>
+          </wp:inline>
+        </w:drawing>
+      </w:r>
       <w:r>
         <w:rPr>
           <w:rFonts w:ascii="Times New Roman" w:hAnsi="Times New Roman" w:cs="Times New Roman"/>

</xml_diff>